<commit_message>
docs: finalize submission brief and test matrix
</commit_message>
<xml_diff>
--- a/output/docx/Nightingale_Technical_Brief.docx
+++ b/output/docx/Nightingale_Technical_Brief.docx
@@ -79,7 +79,7 @@
             <w:r>
               <w:t>BASELINE</w:t>
               <w:br/>
-              <w:t>HEAD 51a1ce4 + F Final working tree</w:t>
+              <w:t>HEAD 21a9a4a + submission closeout</w:t>
             </w:r>
           </w:p>
         </w:tc>
@@ -2264,7 +2264,7 @@
           </w:tcPr>
           <w:p>
             <w:r>
-              <w:t>Default-off local lifecycle; Doctor confirmation requires three source-review attestations. Real ASR inputs and multilingual clinical validity remain NOT_RUN.</w:t>
+              <w:t>Default-off; three review attestations. Local ASR mechanics passed 2/2; clinical multilingual/noisy accuracy remains unverified.</w:t>
             </w:r>
           </w:p>
         </w:tc>
@@ -2406,19 +2406,8 @@
             <w:shd w:fill="DCEAF5" w:val="clear"/>
           </w:tcPr>
           <w:p>
-            <w:pPr>
-              <w:spacing w:before="0" w:after="0" w:line="254" w:lineRule="auto"/>
-              <w:jc w:val="left"/>
-            </w:pPr>
-            <w:r/>
-            <w:r>
-              <w:rPr>
-                <w:rFonts w:ascii="Helvetica Neue" w:hAnsi="Helvetica Neue"/>
-                <w:b/>
-                <w:color w:val="20354D"/>
-                <w:sz w:val="13"/>
-              </w:rPr>
-              <w:t>E5 Submission package</w:t>
+            <w:r>
+              <w:t>Official feedback scenarios 1–16</w:t>
             </w:r>
           </w:p>
         </w:tc>
@@ -2444,7 +2433,7 @@
           </w:tcPr>
           <w:p>
             <w:r>
-              <w:t>REPOSITORY PACKAGE COMPLETE</w:t>
+              <w:t>5 SURVIVE / 9 PARTIAL / 2 DO NOT SURVIVE</w:t>
             </w:r>
           </w:p>
         </w:tc>
@@ -2470,7 +2459,7 @@
           </w:tcPr>
           <w:p>
             <w:r>
-              <w:t>Repository artifacts exist; external video playback, link access and email delivery remain owner-controlled evidence.</w:t>
+              <w:t>#1 phone/WhatsApp identity and #7 streaming in-consult alert are not implemented. Exact first breaks and limits are recorded in the readiness ledger.</w:t>
             </w:r>
           </w:p>
         </w:tc>
@@ -2697,7 +2686,7 @@
           </w:tcPr>
           <w:p>
             <w:r>
-              <w:t>710 passed / 2 skipped</w:t>
+              <w:t>712 passed / 2 skipped</w:t>
             </w:r>
           </w:p>
         </w:tc>
@@ -2723,7 +2712,7 @@
           </w:tcPr>
           <w:p>
             <w:r>
-              <w:t>712 collected; skips require ignored local ASR model/audio inputs. F Final 9/9 passed.</w:t>
+              <w:t>714 collected; default skips require ignored ASR inputs. F Final 9/9 passed.</w:t>
             </w:r>
           </w:p>
         </w:tc>
@@ -2844,7 +2833,7 @@
           </w:tcPr>
           <w:p>
             <w:r>
-              <w:t>Focused regression</w:t>
+              <w:t>Live Provider + local ASR</w:t>
             </w:r>
           </w:p>
         </w:tc>
@@ -2870,7 +2859,7 @@
           </w:tcPr>
           <w:p>
             <w:r>
-              <w:t>75 safety + 62 learning</w:t>
+              <w:t>DeepSeek 4/4 anchors; ASR 2/2</w:t>
             </w:r>
           </w:p>
         </w:tc>
@@ -2896,7 +2885,7 @@
           </w:tcPr>
           <w:p>
             <w:r>
-              <w:t>Provenance/RBAC/publication/concurrency and SL1/SL2/SL3 Shadow isolation passed.</w:t>
+              <w:t>One synthetic Provider run and one generated-audio mechanics run; not clinical validation.</w:t>
             </w:r>
           </w:p>
         </w:tc>
@@ -3036,12 +3025,7 @@
         </w:numPr>
       </w:pPr>
       <w:r>
-        <w:rPr>
-          <w:rFonts w:ascii="Helvetica Neue" w:hAnsi="Helvetica Neue"/>
-          <w:color w:val="20354D"/>
-          <w:sz w:val="16"/>
-        </w:rPr>
-        <w:t>Check-in mock and deterministic fallback journeys are verified; DeepSeek live turn succeeded, but the strict final Summary failed validation and fell back.</w:t>
+        <w:t>Mock and fallback journeys are verified. One current synthetic mixed-language DeepSeek run passed strict schema and exact provenance (4/4 quotes). This is not clinical validation or a full live UI journey.</w:t>
       </w:r>
     </w:p>
     <w:p>
@@ -3054,12 +3038,7 @@
         </w:numPr>
       </w:pPr>
       <w:r>
-        <w:rPr>
-          <w:rFonts w:ascii="Helvetica Neue" w:hAnsi="Helvetica Neue"/>
-          <w:color w:val="20354D"/>
-          <w:sz w:val="16"/>
-        </w:rPr>
-        <w:t>D3 live Provider layer is NOT_RUN by design; D4 frozen Copilot evaluation passed with provider=mock.</w:t>
+        <w:t>Frozen D3/D4 evaluations remain Provider-independent; live DeepSeek evidence is recorded separately.</w:t>
       </w:r>
     </w:p>
     <w:p>
@@ -3072,7 +3051,7 @@
         </w:numPr>
       </w:pPr>
       <w:r>
-        <w:t>E4 is default-off local faster-whisper with no diarization or invented confidence. Doctor Consult confirmation now requires three source-review attestations. A synthetic Malay-English-Hokkien statement passed exact transport and provenance tests; translation, physical microphone, clinical multilingual understanding, and noisy accuracy are NOT_RUN.</w:t>
+        <w:t>Local faster-whisper is default-off and has no diarization. Explicit real-ASR tests passed 2/2 with ignored inputs, but two Malay phrases were misrecognized. Doctor Consult requires three source-review attestations. Physical microphone, noise and clinical multilingual validity remain NOT_RUN.</w:t>
       </w:r>
     </w:p>
     <w:p>
@@ -3305,7 +3284,7 @@
           </w:tcPr>
           <w:p>
             <w:r>
-              <w:t>Shadow learning behind deterministic controls</w:t>
+              <w:t>Shadow learning controls</w:t>
             </w:r>
           </w:p>
         </w:tc>
@@ -3331,7 +3310,7 @@
           </w:tcPr>
           <w:p>
             <w:r>
-              <w:t>Complete candidate snapshots, fixed bands, protection, provenance, caps, freeze/replay and rollback permit evaluation without automatic unsafe demotion or a serving claim.</w:t>
+              <w:t>Frozen Shadow only; caps, provenance, replay, freeze and rollback. It never changes production Glance.</w:t>
             </w:r>
           </w:p>
         </w:tc>

</xml_diff>